<commit_message>
Change 9: Plateau Fund: letter of inquiry deadline changed from December 4, 2026 to December 18, 2026; full application deadline unchanged.
Independent test branch created directly from BASELINE v1-original
(a5b0342). Contains this change only.

Co-Authored-By: Claude Opus 5.5 <noreply@anthropic.com>
Claude-Session: https://claude.ai/code/session_01CQxLpwe1Pu1FJJBAM5jt5M
</commit_message>
<xml_diff>
--- a/documents-src/guidelines/cpcf-plateau-indigenous-communities-fund-2027-rfp.docx
+++ b/documents-src/guidelines/cpcf-plateau-indigenous-communities-fund-2027-rfp.docx
@@ -31,7 +31,7 @@
           <w:color w:val="5F6B6E"/>
           <w:sz w:val="22"/>
         </w:rPr>
-        <w:t>Competitive grant recommended by a community advisory council (two-stage)  ·  Letters of inquiry due December 4, 2026</w:t>
+        <w:t>Competitive grant recommended by a community advisory council (two-stage)  ·  Letters of inquiry due December 18, 2026</w:t>
       </w:r>
     </w:p>
     <w:tbl>
@@ -495,7 +495,7 @@
               <w:rPr>
                 <w:sz w:val="19"/>
               </w:rPr>
-              <w:t>Friday, December 4, 2026, 5:00 p.m. MST</w:t>
+              <w:t>Friday, December 18, 2026, 5:00 p.m. MST</w:t>
             </w:r>
           </w:p>
         </w:tc>
@@ -533,7 +533,7 @@
               <w:rPr>
                 <w:sz w:val="19"/>
               </w:rPr>
-              <w:t>Sent by December 18, 2026</w:t>
+              <w:t>Sent by January 8, 2027</w:t>
             </w:r>
           </w:p>
         </w:tc>
@@ -701,7 +701,7 @@
         <w:t xml:space="preserve">2.  Submit a letter of inquiry. </w:t>
       </w:r>
       <w:r>
-        <w:t>Email the completed Letter of Inquiry Template to grants@cinderpeakscf.org, or call the program officer to schedule an oral letter of inquiry, by 5:00 p.m. MST on December 4, 2026.</w:t>
+        <w:t>Email the completed Letter of Inquiry Template to grants@cinderpeakscf.org, or call the program officer to schedule an oral letter of inquiry, by 5:00 p.m. MST on December 18, 2026.</w:t>
       </w:r>
     </w:p>
     <w:p>
@@ -716,7 +716,7 @@
         <w:t xml:space="preserve">3.  Advisory Council review. </w:t>
       </w:r>
       <w:r>
-        <w:t>The Plateau Fund Advisory Council reviews all letters and invites selected applicants to submit a full application by December 18, 2026.</w:t>
+        <w:t>The Plateau Fund Advisory Council reviews all letters and invites selected applicants to submit a full application by January 8, 2027.</w:t>
       </w:r>
     </w:p>
     <w:p>

</xml_diff>

<commit_message>
Change 15: Plateau Fund: program contact changed from Dana Whitehorse (dwhitehorse@) to Mara Begay (mbegay@).
Independent test branch created directly from BASELINE v1-original
(a5b0342). Contains this change only.

Co-Authored-By: Claude Opus 5.5 <noreply@anthropic.com>
Claude-Session: https://claude.ai/code/session_01CQxLpwe1Pu1FJJBAM5jt5M
</commit_message>
<xml_diff>
--- a/documents-src/guidelines/cpcf-plateau-indigenous-communities-fund-2027-rfp.docx
+++ b/documents-src/guidelines/cpcf-plateau-indigenous-communities-fund-2027-rfp.docx
@@ -976,12 +976,12 @@
           </w:p>
           <w:p>
             <w:r>
-              <w:t>Dana Whitehorse, Program Officer, Indigenous Communities</w:t>
+              <w:t>Mara Begay, Program Officer, Indigenous Communities</w:t>
             </w:r>
           </w:p>
           <w:p>
             <w:r>
-              <w:t>Email: dwhitehorse@cinderpeakscf.org   ·   Phone: (928) 555-0147 ext. 121</w:t>
+              <w:t>Email: mbegay@cinderpeakscf.org   ·   Phone: (928) 555-0147 ext. 121</w:t>
             </w:r>
           </w:p>
           <w:p>

</xml_diff>